<commit_message>
Scope HepatoTwin to ages 12-59, adopt final CAP model (test R² 0.562), update all docs
</commit_message>
<xml_diff>
--- a/HepatoTwin- Weekly Action Plan (2).docx
+++ b/HepatoTwin- Weekly Action Plan (2).docx
@@ -1620,7 +1620,7 @@
               <w:rPr>
                 <w:rtl w:val="0"/>
               </w:rPr>
-              <w:t>Explainability and safety: fibrosis risk (FIB-4) validated against measured liver stiffness, plus referral pathway (§17.2); MASLD/MetALD labelling and safety guardrails (§17.3); per-patient SHAP and conformal CAP intervals (§17.4); causal knowledge graph of 10–15 links (§5.3); download NHANES III ultrasound and Linked Mortality Files and map variables (§17.9)</w:t>
+              <w:t>Done early (22 Oct): final Layer 2 model, scope set to ages 12–59 (test R² 0.562). Explainability and safety: fibrosis risk (FIB-4, ages 18–59) validated against measured liver stiffness, plus referral pathway (§17.2); MASLD/MetALD labelling and safety guardrails (§17.3); per-patient SHAP and conformal CAP intervals (§17.4); causal knowledge graph of 10–15 links (§5.3); download NHANES III ultrasound and Linked Mortality Files and map variables (§17.9)</w:t>
             </w:r>
           </w:p>
         </w:tc>
@@ -1880,7 +1880,7 @@
               <w:rPr>
                 <w:rtl w:val="0"/>
               </w:rPr>
-              <w:t>Evaluation: NHANES III external and mortality validation (§17.9); fibrosis triage accuracy; conformal coverage; fairness audit by sex, ethnicity and age (§17.8, §12.4)</w:t>
+              <w:t>Evaluation: NHANES III external and mortality validation in ages 20–59, inside the model’s scope (§17.9); fibrosis triage accuracy; conformal coverage; fairness audit by sex, ethnicity and age (§17.8, §12.4)</w:t>
             </w:r>
           </w:p>
         </w:tc>

</xml_diff>

<commit_message>
Updated Proposal and Weekly Action Plan based on New synthetic Data idea, and Added Literature Review Docs
</commit_message>
<xml_diff>
--- a/HepatoTwin- Weekly Action Plan (2).docx
+++ b/HepatoTwin- Weekly Action Plan (2).docx
@@ -1620,7 +1620,7 @@
               <w:rPr>
                 <w:rtl w:val="0"/>
               </w:rPr>
-              <w:t>Done early (22 Oct): final Layer 2 model, scope set to ages 12–59 (test R² 0.562). Explainability and safety: fibrosis risk (FIB-4, ages 18–59) validated against measured liver stiffness, plus referral pathway (§17.2); MASLD/MetALD labelling and safety guardrails (§17.3); per-patient SHAP and conformal CAP intervals (§17.4); causal knowledge graph of 10–15 links (§5.3); download NHANES III ultrasound and Linked Mortality Files and map variables (§17.9)</w:t>
+              <w:t>Done early (22 Oct): final Layer 2 model, scope set to ages 12–59 (test R² 0.562). Explainability and safety: fibrosis risk (FIB-4, ages 18–59) validated against measured liver stiffness, plus referral pathway (§17.2); MASLD/MetALD labelling and safety guardrails (§17.3); per-patient SHAP and conformal CAP intervals (§17.4); causal knowledge graph of 10–15 links (§5.3); download NHANES III ultrasound and Linked Mortality Files and map variables (§17.9); in-silico evaluation, part 1 (§17.14): extract effect sizes and calibration targets from the published trials and build the virtual-patient simulator (adherence patterns, weight model, linked body and liver changes)</w:t>
             </w:r>
           </w:p>
         </w:tc>
@@ -1750,7 +1750,7 @@
               <w:rPr>
                 <w:rtl w:val="0"/>
               </w:rPr>
-              <w:t>FastAPI backend wrapping Layers 2–5 with an SQLite database (§16); re-assessment timeline storing dated measurements (§17.5); simple 3D liver S0–S3 with timeline slider (§9): today’s colour from the calibrated steatosis probabilities with their uncertainty rather than the single predicted CAP; future horizons show only the evidence-graded direction; optional view conditional on 5% and 10% weight loss (Vilar-Gomez thresholds)</w:t>
+              <w:t>FastAPI backend wrapping Layers 2–5 with an SQLite database (§16); re-assessment timeline storing dated measurements and food logs, with the predict–observe–compare–adjust loop (§17.5); simple 3D liver S0–S3 with timeline slider (§9): today’s colour from the calibrated steatosis probabilities with their uncertainty rather than the single predicted CAP; future horizons show the projection (direction, evidence label and uncertainty range); optional view conditional on 5% and 10% weight loss (Vilar-Gomez thresholds); in-silico evaluation, part 2 (§17.14): synthetic monthly follow-up (noise, under-reported food logs, missed visits) and calibration of the simulator to trial outcomes</w:t>
             </w:r>
           </w:p>
         </w:tc>
@@ -1880,7 +1880,7 @@
               <w:rPr>
                 <w:rtl w:val="0"/>
               </w:rPr>
-              <w:t>Evaluation: NHANES III external and mortality validation in ages 20–59, inside the model’s scope (§17.9); fibrosis triage accuracy; conformal coverage; fairness audit by sex, ethnicity and age (§17.8, §12.4)</w:t>
+              <w:t>Evaluation: in-silico evaluation of the twin on virtual patients (tracking, time to detect change, projection error, learning, robustness; §12.3, §17.14); NHANES III external and mortality validation in ages 20–59, inside the model’s scope (§17.9); fibrosis triage accuracy; conformal coverage; fairness audit by sex, ethnicity and age (§17.8, §12.4)</w:t>
             </w:r>
           </w:p>
         </w:tc>

</xml_diff>

<commit_message>
Add virtual-patient simulator with cited parameter and calibration tables, and expand in-silico tasks in the weekly plan
</commit_message>
<xml_diff>
--- a/HepatoTwin- Weekly Action Plan (2).docx
+++ b/HepatoTwin- Weekly Action Plan (2).docx
@@ -1620,7 +1620,7 @@
               <w:rPr>
                 <w:rtl w:val="0"/>
               </w:rPr>
-              <w:t>Done early (22 Oct): final Layer 2 model, scope set to ages 12–59 (test R² 0.562). Explainability and safety: fibrosis risk (FIB-4, ages 18–59) validated against measured liver stiffness, plus referral pathway (§17.2); MASLD/MetALD labelling and safety guardrails (§17.3); per-patient SHAP and conformal CAP intervals (§17.4); causal knowledge graph of 10–15 links (§5.3); download NHANES III ultrasound and Linked Mortality Files and map variables (§17.9); in-silico evaluation, part 1 (§17.14): extract effect sizes and calibration targets from the published trials and build the virtual-patient simulator (adherence patterns, weight model, linked body and liver changes)</w:t>
+              <w:t>Done early (22 Oct): final Layer 2 model, scope set to ages 12–59 (test R² 0.562). Explainability and safety: fibrosis risk (FIB-4, ages 18–59) validated against measured liver stiffness, plus referral pathway (§17.2); MASLD/MetALD labelling and safety guardrails (§17.3); per-patient SHAP and conformal CAP intervals (§17.4); causal knowledge graph of 10–15 links (§5.3); download NHANES III ultrasound and Linked Mortality Files and map variables (§17.9); in-silico evaluation, part 1 (§17.14): extract effect sizes (Wing 2011, Koutoukidis 2019, Mensink 2016, Lim 2011, Vilar-Gomez 2015) and calibration targets (Look AHEAD, DPP, Vilar-Gomez), marking which targets are held back to check the tuned simulator; build the virtual-patient simulator, independent of the Layer 2 model: month 0 from real in-scope NHANES test patients, scenario A, scenario B or usual diet, adherence patterns (steady, slipping, regaining, dropping out), monthly weight from the NIH body-weight model (Hall 2011), and linked changes in waist, blood markers and liver fat</w:t>
             </w:r>
           </w:p>
         </w:tc>
@@ -1750,7 +1750,7 @@
               <w:rPr>
                 <w:rtl w:val="0"/>
               </w:rPr>
-              <w:t>FastAPI backend wrapping Layers 2–5 with an SQLite database (§16); re-assessment timeline storing dated measurements and food logs, with the predict–observe–compare–adjust loop (§17.5); simple 3D liver S0–S3 with timeline slider (§9): today’s colour from the calibrated steatosis probabilities with their uncertainty rather than the single predicted CAP; future horizons show the projection (direction, evidence label and uncertainty range); optional view conditional on 5% and 10% weight loss (Vilar-Gomez thresholds); in-silico evaluation, part 2 (§17.14): synthetic monthly follow-up (noise, under-reported food logs, missed visits) and calibration of the simulator to trial outcomes</w:t>
+              <w:t>FastAPI backend wrapping Layers 2–5 with an SQLite database (§16); re-assessment timeline storing dated measurements and food logs, with the predict–observe–compare–adjust loop (§17.5); simple 3D liver S0–S3 with timeline slider (§9): today’s colour from the calibrated steatosis probabilities with their uncertainty rather than the single predicted CAP; future horizons show the projection (direction, evidence label and uncertainty range); optional view conditional on 5% and 10% weight loss (Vilar-Gomez thresholds); in-silico evaluation, part 2 (§17.14): observation layer that turns the simulated truth into what the twin sees (biological and analytical variation from the EFLM database, under-reported food logs as in the OPEN study, quarterly blood tests, missed visits more likely when a patient is doing badly); tune adherence, regain and response spread until trial-like virtual patients reproduce the published outcomes, then check against the held-back targets; generate 12 months of follow-up for the in-scope test patients under each scenario</w:t>
             </w:r>
           </w:p>
         </w:tc>
@@ -1880,7 +1880,7 @@
               <w:rPr>
                 <w:rtl w:val="0"/>
               </w:rPr>
-              <w:t>Evaluation: in-silico evaluation of the twin on virtual patients (tracking, time to detect change, projection error, learning, robustness; §12.3, §17.14); NHANES III external and mortality validation in ages 20–59, inside the model’s scope (§17.9); fibrosis triage accuracy; conformal coverage; fairness audit by sex, ethnicity and age (§17.8, §12.4)</w:t>
+              <w:t>Evaluation: in-silico evaluation of the twin on virtual patients (§12.3, §17.14): the twin sees only the noisy observations and runs the predict–observe–compare–adjust loop month by month; measure how closely it tracks the true state (AUC and Brier score by month), months to detect a change, projection error at 3, 6 and 12 months, whether error falls as it learns each patient’s response, robustness to noisy, biased and missing inputs, and whether scenarios rank in their true order; NHANES III external and mortality validation in ages 20–59, inside the model’s scope (§17.9); fibrosis triage accuracy; conformal coverage; fairness audit by sex, ethnicity and age (§17.8, §12.4)</w:t>
             </w:r>
           </w:p>
         </w:tc>
@@ -2010,7 +2010,7 @@
               <w:rPr>
                 <w:rtl w:val="0"/>
               </w:rPr>
-              <w:t>Freeze scope; consolidate results; update Appendix A and write the twin-state, evidence and scenario chapters. If behind, apply the proposal’s cut list (3D fidelity first, then panel size, then evidence-table breadth)</w:t>
+              <w:t>Freeze scope; consolidate results; update Appendix A and write the twin-state, evidence and scenario chapters, including the in-silico evaluation and its limits (it verifies the twin’s updating, not its accuracy for real patients; calibration trials are almost all in adults). If behind, apply the proposal’s cut list (3D fidelity first, then panel size, then evidence-table breadth)</w:t>
             </w:r>
           </w:p>
         </w:tc>

</xml_diff>